<commit_message>
Release 2026-01-25: sync guides with README, regenerate PDF/DOCX/RTF
Complete Guide: from README (Ishikawa, A3, Sources, disclaimer, fixes); drop badges/image/download block; add release date.
Quick Reference: D8 wording, Ishikawa/A3 blurbs, PADDER option, date.
Pandoc: xelatex for PDF (Unicode/emoji); DOCX/RTF with --toc. Update sizes, releases/README.
</commit_message>
<xml_diff>
--- a/releases/Awesome-Mnemonics-Quick-Reference.docx
+++ b/releases/Awesome-Mnemonics-Quick-Reference.docx
@@ -21,14 +21,14 @@
         <w:p>
           <w:r>
             <w:fldChar w:fldCharType="begin" w:dirty="true"/>
-            <w:instrText xml:space="preserve">TOC \o "1-3" \h \z \u</w:instrText>
+            <w:instrText xml:space="preserve">TOC \o "1-2" \h \z \u</w:instrText>
             <w:fldChar w:fldCharType="separate"/>
             <w:fldChar w:fldCharType="end"/>
           </w:r>
         </w:p>
       </w:sdtContent>
     </w:sdt>
-    <w:bookmarkStart w:id="41" w:name="awesome-mnemonics---quick-reference-card"/>
+    <w:bookmarkStart w:id="43" w:name="awesome-mnemonics---quick-reference-card"/>
     <w:p>
       <w:pPr>
         <w:pStyle w:val="Heading1"/>
@@ -58,7 +58,7 @@
           <w:i/>
           <w:iCs/>
         </w:rPr>
-        <w:t xml:space="preserve">Release Version - Last Updated: $(date +%Y-%m-%d)</w:t>
+        <w:t xml:space="preserve">Release Version - Last Updated: 2026-01-25</w:t>
       </w:r>
     </w:p>
     <w:p>
@@ -559,7 +559,7 @@
         </w:numPr>
       </w:pPr>
       <w:r>
-        <w:t xml:space="preserve">D8 - Closure &amp; Celebration</w:t>
+        <w:t xml:space="preserve">D8 - Congratulate your team and close the loop (closure &amp; celebration)</w:t>
       </w:r>
     </w:p>
     <w:p>
@@ -1065,7 +1065,7 @@
     </w:p>
     <w:bookmarkEnd w:id="22"/>
     <w:bookmarkEnd w:id="23"/>
-    <w:bookmarkStart w:id="27" w:name="root-cause-analysis"/>
+    <w:bookmarkStart w:id="29" w:name="root-cause-analysis"/>
     <w:p>
       <w:pPr>
         <w:pStyle w:val="Heading2"/>
@@ -1232,12 +1232,56 @@
       </w:r>
     </w:p>
     <w:bookmarkEnd w:id="25"/>
-    <w:bookmarkStart w:id="26" w:name="padder"/>
+    <w:bookmarkStart w:id="26" w:name="ishikawa-fishbone"/>
     <w:p>
       <w:pPr>
         <w:pStyle w:val="Heading3"/>
       </w:pPr>
       <w:r>
+        <w:t xml:space="preserve">Ishikawa (Fishbone)</w:t>
+      </w:r>
+    </w:p>
+    <w:p>
+      <w:pPr>
+        <w:pStyle w:val="Compact"/>
+        <w:numPr>
+          <w:ilvl w:val="0"/>
+          <w:numId w:val="1015"/>
+        </w:numPr>
+      </w:pPr>
+      <w:r>
+        <w:t xml:space="preserve">State problem (head); choose categories (e.g. 6 M’s); brainstorm causes (bones); use 5 Whys on branches</w:t>
+      </w:r>
+    </w:p>
+    <w:bookmarkEnd w:id="26"/>
+    <w:bookmarkStart w:id="27" w:name="a3-problem-solving"/>
+    <w:p>
+      <w:pPr>
+        <w:pStyle w:val="Heading3"/>
+      </w:pPr>
+      <w:r>
+        <w:t xml:space="preserve">A3 Problem Solving</w:t>
+      </w:r>
+    </w:p>
+    <w:p>
+      <w:pPr>
+        <w:pStyle w:val="Compact"/>
+        <w:numPr>
+          <w:ilvl w:val="0"/>
+          <w:numId w:val="1016"/>
+        </w:numPr>
+      </w:pPr>
+      <w:r>
+        <w:t xml:space="preserve">One-page: Background, Current state, Goal, Root cause (5 Whys/Ishikawa), Countermeasures, Plan</w:t>
+      </w:r>
+    </w:p>
+    <w:bookmarkEnd w:id="27"/>
+    <w:bookmarkStart w:id="28" w:name="padder"/>
+    <w:p>
+      <w:pPr>
+        <w:pStyle w:val="Heading3"/>
+      </w:pPr>
+      <w:r>
         <w:t xml:space="preserve">PADDER</w:t>
       </w:r>
     </w:p>
@@ -1246,7 +1290,7 @@
         <w:pStyle w:val="Compact"/>
         <w:numPr>
           <w:ilvl w:val="0"/>
-          <w:numId w:val="1015"/>
+          <w:numId w:val="1017"/>
         </w:numPr>
       </w:pPr>
       <w:r>
@@ -1258,7 +1302,7 @@
         <w:pStyle w:val="Compact"/>
         <w:numPr>
           <w:ilvl w:val="0"/>
-          <w:numId w:val="1015"/>
+          <w:numId w:val="1017"/>
         </w:numPr>
       </w:pPr>
       <w:r>
@@ -1270,19 +1314,19 @@
         <w:pStyle w:val="Compact"/>
         <w:numPr>
           <w:ilvl w:val="0"/>
-          <w:numId w:val="1015"/>
-        </w:numPr>
-      </w:pPr>
-      <w:r>
-        <w:t xml:space="preserve">D - Develop solution &amp; consider other ways</w:t>
-      </w:r>
-    </w:p>
-    <w:p>
-      <w:pPr>
-        <w:pStyle w:val="Compact"/>
-        <w:numPr>
-          <w:ilvl w:val="0"/>
-          <w:numId w:val="1015"/>
+          <w:numId w:val="1017"/>
+        </w:numPr>
+      </w:pPr>
+      <w:r>
+        <w:t xml:space="preserve">D - Develop solution &amp; consider other ways—try to have more than one option</w:t>
+      </w:r>
+    </w:p>
+    <w:p>
+      <w:pPr>
+        <w:pStyle w:val="Compact"/>
+        <w:numPr>
+          <w:ilvl w:val="0"/>
+          <w:numId w:val="1017"/>
         </w:numPr>
       </w:pPr>
       <w:r>
@@ -1294,7 +1338,7 @@
         <w:pStyle w:val="Compact"/>
         <w:numPr>
           <w:ilvl w:val="0"/>
-          <w:numId w:val="1015"/>
+          <w:numId w:val="1017"/>
         </w:numPr>
       </w:pPr>
       <w:r>
@@ -1306,7 +1350,7 @@
         <w:pStyle w:val="Compact"/>
         <w:numPr>
           <w:ilvl w:val="0"/>
-          <w:numId w:val="1015"/>
+          <w:numId w:val="1017"/>
         </w:numPr>
       </w:pPr>
       <w:r>
@@ -1320,9 +1364,9 @@
         </w:pict>
       </w:r>
     </w:p>
-    <w:bookmarkEnd w:id="26"/>
-    <w:bookmarkEnd w:id="27"/>
-    <w:bookmarkStart w:id="31" w:name="stress-management"/>
+    <w:bookmarkEnd w:id="28"/>
+    <w:bookmarkEnd w:id="29"/>
+    <w:bookmarkStart w:id="33" w:name="stress-management"/>
     <w:p>
       <w:pPr>
         <w:pStyle w:val="Heading2"/>
@@ -1349,7 +1393,7 @@
         <w:t xml:space="preserve">(10-15 min immediate, 2-4 weeks long-term)</w:t>
       </w:r>
     </w:p>
-    <w:bookmarkStart w:id="28" w:name="pace-immediate"/>
+    <w:bookmarkStart w:id="30" w:name="pace-immediate"/>
     <w:p>
       <w:pPr>
         <w:pStyle w:val="Heading3"/>
@@ -1363,7 +1407,7 @@
         <w:pStyle w:val="Compact"/>
         <w:numPr>
           <w:ilvl w:val="0"/>
-          <w:numId w:val="1016"/>
+          <w:numId w:val="1018"/>
         </w:numPr>
       </w:pPr>
       <w:r>
@@ -1375,7 +1419,7 @@
         <w:pStyle w:val="Compact"/>
         <w:numPr>
           <w:ilvl w:val="0"/>
-          <w:numId w:val="1016"/>
+          <w:numId w:val="1018"/>
         </w:numPr>
       </w:pPr>
       <w:r>
@@ -1387,7 +1431,7 @@
         <w:pStyle w:val="Compact"/>
         <w:numPr>
           <w:ilvl w:val="0"/>
-          <w:numId w:val="1016"/>
+          <w:numId w:val="1018"/>
         </w:numPr>
       </w:pPr>
       <w:r>
@@ -1399,15 +1443,15 @@
         <w:pStyle w:val="Compact"/>
         <w:numPr>
           <w:ilvl w:val="0"/>
-          <w:numId w:val="1016"/>
+          <w:numId w:val="1018"/>
         </w:numPr>
       </w:pPr>
       <w:r>
         <w:t xml:space="preserve">E - Emotional awareness</w:t>
       </w:r>
     </w:p>
-    <w:bookmarkEnd w:id="28"/>
-    <w:bookmarkStart w:id="29" w:name="aries-lifestyle"/>
+    <w:bookmarkEnd w:id="30"/>
+    <w:bookmarkStart w:id="31" w:name="aries-lifestyle"/>
     <w:p>
       <w:pPr>
         <w:pStyle w:val="Heading3"/>
@@ -1421,7 +1465,7 @@
         <w:pStyle w:val="Compact"/>
         <w:numPr>
           <w:ilvl w:val="0"/>
-          <w:numId w:val="1017"/>
+          <w:numId w:val="1019"/>
         </w:numPr>
       </w:pPr>
       <w:r>
@@ -1433,7 +1477,7 @@
         <w:pStyle w:val="Compact"/>
         <w:numPr>
           <w:ilvl w:val="0"/>
-          <w:numId w:val="1017"/>
+          <w:numId w:val="1019"/>
         </w:numPr>
       </w:pPr>
       <w:r>
@@ -1445,7 +1489,7 @@
         <w:pStyle w:val="Compact"/>
         <w:numPr>
           <w:ilvl w:val="0"/>
-          <w:numId w:val="1017"/>
+          <w:numId w:val="1019"/>
         </w:numPr>
       </w:pPr>
       <w:r>
@@ -1457,7 +1501,7 @@
         <w:pStyle w:val="Compact"/>
         <w:numPr>
           <w:ilvl w:val="0"/>
-          <w:numId w:val="1017"/>
+          <w:numId w:val="1019"/>
         </w:numPr>
       </w:pPr>
       <w:r>
@@ -1469,15 +1513,15 @@
         <w:pStyle w:val="Compact"/>
         <w:numPr>
           <w:ilvl w:val="0"/>
-          <w:numId w:val="1017"/>
+          <w:numId w:val="1019"/>
         </w:numPr>
       </w:pPr>
       <w:r>
         <w:t xml:space="preserve">S - Sleep well</w:t>
       </w:r>
     </w:p>
-    <w:bookmarkEnd w:id="29"/>
-    <w:bookmarkStart w:id="30" w:name="calm-mental-framework"/>
+    <w:bookmarkEnd w:id="31"/>
+    <w:bookmarkStart w:id="32" w:name="calm-mental-framework"/>
     <w:p>
       <w:pPr>
         <w:pStyle w:val="Heading3"/>
@@ -1491,7 +1535,7 @@
         <w:pStyle w:val="Compact"/>
         <w:numPr>
           <w:ilvl w:val="0"/>
-          <w:numId w:val="1018"/>
+          <w:numId w:val="1020"/>
         </w:numPr>
       </w:pPr>
       <w:r>
@@ -1503,7 +1547,7 @@
         <w:pStyle w:val="Compact"/>
         <w:numPr>
           <w:ilvl w:val="0"/>
-          <w:numId w:val="1018"/>
+          <w:numId w:val="1020"/>
         </w:numPr>
       </w:pPr>
       <w:r>
@@ -1515,7 +1559,7 @@
         <w:pStyle w:val="Compact"/>
         <w:numPr>
           <w:ilvl w:val="0"/>
-          <w:numId w:val="1018"/>
+          <w:numId w:val="1020"/>
         </w:numPr>
       </w:pPr>
       <w:r>
@@ -1527,7 +1571,7 @@
         <w:pStyle w:val="Compact"/>
         <w:numPr>
           <w:ilvl w:val="0"/>
-          <w:numId w:val="1018"/>
+          <w:numId w:val="1020"/>
         </w:numPr>
       </w:pPr>
       <w:r>
@@ -1541,9 +1585,9 @@
         </w:pict>
       </w:r>
     </w:p>
-    <w:bookmarkEnd w:id="30"/>
-    <w:bookmarkEnd w:id="31"/>
-    <w:bookmarkStart w:id="36" w:name="infrastructure-design"/>
+    <w:bookmarkEnd w:id="32"/>
+    <w:bookmarkEnd w:id="33"/>
+    <w:bookmarkStart w:id="38" w:name="infrastructure-design"/>
     <w:p>
       <w:pPr>
         <w:pStyle w:val="Heading2"/>
@@ -1564,7 +1608,7 @@
         <w:t xml:space="preserve">SCALE → SWOT → PESTEL → SET</w:t>
       </w:r>
     </w:p>
-    <w:bookmarkStart w:id="32" w:name="scale"/>
+    <w:bookmarkStart w:id="34" w:name="scale"/>
     <w:p>
       <w:pPr>
         <w:pStyle w:val="Heading3"/>
@@ -1578,7 +1622,7 @@
         <w:pStyle w:val="Compact"/>
         <w:numPr>
           <w:ilvl w:val="0"/>
-          <w:numId w:val="1019"/>
+          <w:numId w:val="1021"/>
         </w:numPr>
       </w:pPr>
       <w:r>
@@ -1590,7 +1634,7 @@
         <w:pStyle w:val="Compact"/>
         <w:numPr>
           <w:ilvl w:val="0"/>
-          <w:numId w:val="1019"/>
+          <w:numId w:val="1021"/>
         </w:numPr>
       </w:pPr>
       <w:r>
@@ -1602,7 +1646,7 @@
         <w:pStyle w:val="Compact"/>
         <w:numPr>
           <w:ilvl w:val="0"/>
-          <w:numId w:val="1019"/>
+          <w:numId w:val="1021"/>
         </w:numPr>
       </w:pPr>
       <w:r>
@@ -1614,7 +1658,7 @@
         <w:pStyle w:val="Compact"/>
         <w:numPr>
           <w:ilvl w:val="0"/>
-          <w:numId w:val="1019"/>
+          <w:numId w:val="1021"/>
         </w:numPr>
       </w:pPr>
       <w:r>
@@ -1626,15 +1670,15 @@
         <w:pStyle w:val="Compact"/>
         <w:numPr>
           <w:ilvl w:val="0"/>
-          <w:numId w:val="1019"/>
+          <w:numId w:val="1021"/>
         </w:numPr>
       </w:pPr>
       <w:r>
         <w:t xml:space="preserve">E - Error handling/resilience</w:t>
       </w:r>
     </w:p>
-    <w:bookmarkEnd w:id="32"/>
-    <w:bookmarkStart w:id="33" w:name="swot-evaluate-design"/>
+    <w:bookmarkEnd w:id="34"/>
+    <w:bookmarkStart w:id="35" w:name="swot-evaluate-design"/>
     <w:p>
       <w:pPr>
         <w:pStyle w:val="Heading3"/>
@@ -1648,7 +1692,7 @@
         <w:pStyle w:val="Compact"/>
         <w:numPr>
           <w:ilvl w:val="0"/>
-          <w:numId w:val="1020"/>
+          <w:numId w:val="1022"/>
         </w:numPr>
       </w:pPr>
       <w:r>
@@ -1660,7 +1704,7 @@
         <w:pStyle w:val="Compact"/>
         <w:numPr>
           <w:ilvl w:val="0"/>
-          <w:numId w:val="1020"/>
+          <w:numId w:val="1022"/>
         </w:numPr>
       </w:pPr>
       <w:r>
@@ -1672,7 +1716,7 @@
         <w:pStyle w:val="Compact"/>
         <w:numPr>
           <w:ilvl w:val="0"/>
-          <w:numId w:val="1020"/>
+          <w:numId w:val="1022"/>
         </w:numPr>
       </w:pPr>
       <w:r>
@@ -1684,15 +1728,15 @@
         <w:pStyle w:val="Compact"/>
         <w:numPr>
           <w:ilvl w:val="0"/>
-          <w:numId w:val="1020"/>
+          <w:numId w:val="1022"/>
         </w:numPr>
       </w:pPr>
       <w:r>
         <w:t xml:space="preserve">T - Threats</w:t>
       </w:r>
     </w:p>
-    <w:bookmarkEnd w:id="33"/>
-    <w:bookmarkStart w:id="34" w:name="pestel-external-factors"/>
+    <w:bookmarkEnd w:id="35"/>
+    <w:bookmarkStart w:id="36" w:name="pestel-external-factors"/>
     <w:p>
       <w:pPr>
         <w:pStyle w:val="Heading3"/>
@@ -1706,7 +1750,7 @@
         <w:pStyle w:val="Compact"/>
         <w:numPr>
           <w:ilvl w:val="0"/>
-          <w:numId w:val="1021"/>
+          <w:numId w:val="1023"/>
         </w:numPr>
       </w:pPr>
       <w:r>
@@ -1718,7 +1762,7 @@
         <w:pStyle w:val="Compact"/>
         <w:numPr>
           <w:ilvl w:val="0"/>
-          <w:numId w:val="1021"/>
+          <w:numId w:val="1023"/>
         </w:numPr>
       </w:pPr>
       <w:r>
@@ -1730,7 +1774,7 @@
         <w:pStyle w:val="Compact"/>
         <w:numPr>
           <w:ilvl w:val="0"/>
-          <w:numId w:val="1021"/>
+          <w:numId w:val="1023"/>
         </w:numPr>
       </w:pPr>
       <w:r>
@@ -1742,7 +1786,7 @@
         <w:pStyle w:val="Compact"/>
         <w:numPr>
           <w:ilvl w:val="0"/>
-          <w:numId w:val="1021"/>
+          <w:numId w:val="1023"/>
         </w:numPr>
       </w:pPr>
       <w:r>
@@ -1754,7 +1798,7 @@
         <w:pStyle w:val="Compact"/>
         <w:numPr>
           <w:ilvl w:val="0"/>
-          <w:numId w:val="1021"/>
+          <w:numId w:val="1023"/>
         </w:numPr>
       </w:pPr>
       <w:r>
@@ -1766,15 +1810,15 @@
         <w:pStyle w:val="Compact"/>
         <w:numPr>
           <w:ilvl w:val="0"/>
-          <w:numId w:val="1021"/>
+          <w:numId w:val="1023"/>
         </w:numPr>
       </w:pPr>
       <w:r>
         <w:t xml:space="preserve">L - Legal</w:t>
       </w:r>
     </w:p>
-    <w:bookmarkEnd w:id="34"/>
-    <w:bookmarkStart w:id="35" w:name="set-triangle-pick-2"/>
+    <w:bookmarkEnd w:id="36"/>
+    <w:bookmarkStart w:id="37" w:name="set-triangle-pick-2"/>
     <w:p>
       <w:pPr>
         <w:pStyle w:val="Heading3"/>
@@ -1788,7 +1832,7 @@
         <w:pStyle w:val="Compact"/>
         <w:numPr>
           <w:ilvl w:val="0"/>
-          <w:numId w:val="1022"/>
+          <w:numId w:val="1024"/>
         </w:numPr>
       </w:pPr>
       <w:r>
@@ -1800,7 +1844,7 @@
         <w:pStyle w:val="Compact"/>
         <w:numPr>
           <w:ilvl w:val="0"/>
-          <w:numId w:val="1022"/>
+          <w:numId w:val="1024"/>
         </w:numPr>
       </w:pPr>
       <w:r>
@@ -1814,9 +1858,9 @@
         </w:pict>
       </w:r>
     </w:p>
-    <w:bookmarkEnd w:id="35"/>
-    <w:bookmarkEnd w:id="36"/>
-    <w:bookmarkStart w:id="37" w:name="quick-situation-guide"/>
+    <w:bookmarkEnd w:id="37"/>
+    <w:bookmarkEnd w:id="38"/>
+    <w:bookmarkStart w:id="39" w:name="quick-situation-guide"/>
     <w:p>
       <w:pPr>
         <w:pStyle w:val="Heading2"/>
@@ -2127,8 +2171,8 @@
         </w:pict>
       </w:r>
     </w:p>
-    <w:bookmarkEnd w:id="37"/>
-    <w:bookmarkStart w:id="39" w:name="network-troubleshooting"/>
+    <w:bookmarkEnd w:id="39"/>
+    <w:bookmarkStart w:id="41" w:name="network-troubleshooting"/>
     <w:p>
       <w:pPr>
         <w:pStyle w:val="Heading2"/>
@@ -2137,7 +2181,7 @@
         <w:t xml:space="preserve">Network Troubleshooting</w:t>
       </w:r>
     </w:p>
-    <w:bookmarkStart w:id="38" w:name="trace"/>
+    <w:bookmarkStart w:id="40" w:name="trace"/>
     <w:p>
       <w:pPr>
         <w:pStyle w:val="Heading3"/>
@@ -2151,7 +2195,7 @@
         <w:pStyle w:val="Compact"/>
         <w:numPr>
           <w:ilvl w:val="0"/>
-          <w:numId w:val="1023"/>
+          <w:numId w:val="1025"/>
         </w:numPr>
       </w:pPr>
       <w:r>
@@ -2163,7 +2207,7 @@
         <w:pStyle w:val="Compact"/>
         <w:numPr>
           <w:ilvl w:val="0"/>
-          <w:numId w:val="1023"/>
+          <w:numId w:val="1025"/>
         </w:numPr>
       </w:pPr>
       <w:r>
@@ -2175,7 +2219,7 @@
         <w:pStyle w:val="Compact"/>
         <w:numPr>
           <w:ilvl w:val="0"/>
-          <w:numId w:val="1023"/>
+          <w:numId w:val="1025"/>
         </w:numPr>
       </w:pPr>
       <w:r>
@@ -2187,7 +2231,7 @@
         <w:pStyle w:val="Compact"/>
         <w:numPr>
           <w:ilvl w:val="0"/>
-          <w:numId w:val="1023"/>
+          <w:numId w:val="1025"/>
         </w:numPr>
       </w:pPr>
       <w:r>
@@ -2199,7 +2243,7 @@
         <w:pStyle w:val="Compact"/>
         <w:numPr>
           <w:ilvl w:val="0"/>
-          <w:numId w:val="1023"/>
+          <w:numId w:val="1025"/>
         </w:numPr>
       </w:pPr>
       <w:r>
@@ -2213,9 +2257,9 @@
         </w:pict>
       </w:r>
     </w:p>
-    <w:bookmarkEnd w:id="38"/>
-    <w:bookmarkEnd w:id="39"/>
-    <w:bookmarkStart w:id="40" w:name="key-principles"/>
+    <w:bookmarkEnd w:id="40"/>
+    <w:bookmarkEnd w:id="41"/>
+    <w:bookmarkStart w:id="42" w:name="key-principles"/>
     <w:p>
       <w:pPr>
         <w:pStyle w:val="Heading2"/>
@@ -2229,7 +2273,7 @@
         <w:pStyle w:val="Compact"/>
         <w:numPr>
           <w:ilvl w:val="0"/>
-          <w:numId w:val="1024"/>
+          <w:numId w:val="1026"/>
         </w:numPr>
       </w:pPr>
       <w:r>
@@ -2251,7 +2295,7 @@
         <w:pStyle w:val="Compact"/>
         <w:numPr>
           <w:ilvl w:val="0"/>
-          <w:numId w:val="1024"/>
+          <w:numId w:val="1026"/>
         </w:numPr>
       </w:pPr>
       <w:r>
@@ -2273,7 +2317,7 @@
         <w:pStyle w:val="Compact"/>
         <w:numPr>
           <w:ilvl w:val="0"/>
-          <w:numId w:val="1024"/>
+          <w:numId w:val="1026"/>
         </w:numPr>
       </w:pPr>
       <w:r>
@@ -2295,7 +2339,7 @@
         <w:pStyle w:val="Compact"/>
         <w:numPr>
           <w:ilvl w:val="0"/>
-          <w:numId w:val="1024"/>
+          <w:numId w:val="1026"/>
         </w:numPr>
       </w:pPr>
       <w:r>
@@ -2317,7 +2361,7 @@
         <w:pStyle w:val="Compact"/>
         <w:numPr>
           <w:ilvl w:val="0"/>
-          <w:numId w:val="1024"/>
+          <w:numId w:val="1026"/>
         </w:numPr>
       </w:pPr>
       <w:r>
@@ -2371,8 +2415,8 @@
         <w:t xml:space="preserve">Print this on one page (front/back) for quick reference during incidents</w:t>
       </w:r>
     </w:p>
-    <w:bookmarkEnd w:id="40"/>
-    <w:bookmarkEnd w:id="41"/>
+    <w:bookmarkEnd w:id="42"/>
+    <w:bookmarkEnd w:id="43"/>
     <w:sectPr>
       <w:footnotePr>
         <w:numRestart w:val="eachSect"/>
@@ -2744,6 +2788,12 @@
     <w:abstractNumId w:val="991"/>
   </w:num>
   <w:num w:numId="1024">
+    <w:abstractNumId w:val="991"/>
+  </w:num>
+  <w:num w:numId="1025">
+    <w:abstractNumId w:val="991"/>
+  </w:num>
+  <w:num w:numId="1026">
     <w:abstractNumId w:val="99411"/>
     <w:lvlOverride w:ilvl="0">
       <w:startOverride w:val="1"/>

</xml_diff>

<commit_message>
Automate DOCX/PDF/RTF generation and create ZIP bundles
- Updated build-releases.py to automatically generate DOCX, RTF, and PDF files using pandoc
- Added ZIP bundle creation for both Complete Guide and Quick Reference
- Regenerated all downloadable formats with v2.8 content
- Created generate-docx.sh helper script for manual regeneration
- All download links in README.md verified and working
</commit_message>
<xml_diff>
--- a/releases/Awesome-Mnemonics-Quick-Reference.docx
+++ b/releases/Awesome-Mnemonics-Quick-Reference.docx
@@ -47,18 +47,6 @@
           <w:bCs/>
         </w:rPr>
         <w:t xml:space="preserve">Print this page for your desk or on-call kit</w:t>
-      </w:r>
-    </w:p>
-    <w:p>
-      <w:pPr>
-        <w:pStyle w:val="BodyText"/>
-      </w:pPr>
-      <w:r>
-        <w:rPr>
-          <w:i/>
-          <w:iCs/>
-        </w:rPr>
-        <w:t xml:space="preserve">Release v2.6 — 2026-01-25</w:t>
       </w:r>
     </w:p>
     <w:p>

</xml_diff>